<commit_message>
refactor: update documentation and improve setup instructions
- Removed outdated Documentation.zip file.
- Enhanced clarity and detail in the build_presentation.py and build_setup_doc.py scripts, including updated bullet points and section headings for better readability.
- Updated chain_data.json with the latest blockchain state, reflecting changes in lastUpdated and currentBlock values.
- Made various adjustments across multiple documentation files to ensure consistency and accuracy.
</commit_message>
<xml_diff>
--- a/Documentation/Chapter_1_Introduction.docx
+++ b/Documentation/Chapter_1_Introduction.docx
@@ -98,17 +98,7 @@
         <w:ind w:left="360"/>
       </w:pPr>
       <w:r>
-        <w:rPr>
-          <w:rFonts w:hint="default" w:ascii="sans-serif" w:hAnsi="sans-serif" w:cs="sans-serif"/>
-          <w:i w:val="0"/>
-          <w:iCs w:val="0"/>
-          <w:color w:val="000000"/>
-          <w:sz w:val="22"/>
-          <w:szCs w:val="22"/>
-          <w:u w:val="none"/>
-          <w:vertAlign w:val="baseline"/>
-        </w:rPr>
-        <w:t>Higher educational institutions have undergone a paradigm shift in how academic information, requests, and interpersonal communication occur between students and faculty members. The trend towards digital learning environments has seen an emergence of web-based applications, messaging services, and collaborative portals for sharing assignments, private grade inquiries, and research documents.</w:t>
+        <w:t>Modern universities depend heavily on digital channels to support everyday academic exchanges between students, lecturers, and administrators. As learning management systems and web portals proliferate, routine interactions—ranging from assignment submissions and grade inquiries to research collaboration—increasingly flow through electronic messaging platforms.</w:t>
       </w:r>
     </w:p>
     <w:p>
@@ -123,17 +113,7 @@
         <w:ind w:left="360"/>
       </w:pPr>
       <w:r>
-        <w:rPr>
-          <w:rFonts w:hint="default" w:ascii="sans-serif" w:hAnsi="sans-serif" w:cs="sans-serif"/>
-          <w:i w:val="0"/>
-          <w:iCs w:val="0"/>
-          <w:color w:val="000000"/>
-          <w:sz w:val="22"/>
-          <w:szCs w:val="22"/>
-          <w:u w:val="none"/>
-          <w:vertAlign w:val="baseline"/>
-        </w:rPr>
-        <w:t>Despite the convenience of instant messaging tools, the tools currently used have one limitation - they have been designed primarily for quick delivery of messages. Commercial messenger platforms and standard email programs do not have built-in guarantees that message contents remain confidential and immutable from delivery time to viewing time. At the point of message delivery, there may be no independent verification that a received document was exactly as intended when it was sent.</w:t>
+        <w:t>Yet existing communication channels prioritize transmission speed over cryptographic verification. Neither commercial chat platforms (such as WhatsApp or Slack) nor standard email servers provide native guarantees that message payloads remain un-tampered from sender dispatch to recipient receipt. When a file is transmitted, recipients lack a decentralized mechanism to prove the document's original state.</w:t>
       </w:r>
     </w:p>
     <w:p>
@@ -148,17 +128,7 @@
         <w:ind w:left="360"/>
       </w:pPr>
       <w:r>
-        <w:rPr>
-          <w:rFonts w:hint="default" w:ascii="sans-serif" w:hAnsi="sans-serif" w:cs="sans-serif"/>
-          <w:i w:val="0"/>
-          <w:iCs w:val="0"/>
-          <w:color w:val="000000"/>
-          <w:sz w:val="22"/>
-          <w:szCs w:val="22"/>
-          <w:u w:val="none"/>
-          <w:vertAlign w:val="baseline"/>
-        </w:rPr>
-        <w:t>Academic institutions often face issues with dispute resolution around assignment deadlines, grade tampering, and altered lecture notes. When such disagreements arise, the administration has no independent source of truth to verify if the contents of a file had changed from submission to grading time because system data is often subject to human modification. It is desirable to have a messaging system that offers near real-time conversation alongside an immutable audit trail of all actions taken.</w:t>
+        <w:t>Consequently, higher education administrators frequently struggle with disputes over submission timestamps, grade modifications, and altered course materials. Because centralized database records remain susceptible to administrative overrides or direct database tampering, institutions lack an un-manipulable ledger of truth. Resolving these disputes requires a messaging architecture capable of maintaining instant, low-latency interaction while concurrently capturing immutable, cryptographically verifiable audit logs.</w:t>
       </w:r>
     </w:p>
     <w:p>
@@ -173,17 +143,7 @@
         <w:ind w:left="360"/>
       </w:pPr>
       <w:r>
-        <w:rPr>
-          <w:rFonts w:hint="default" w:ascii="sans-serif" w:hAnsi="sans-serif" w:cs="sans-serif"/>
-          <w:i w:val="0"/>
-          <w:iCs w:val="0"/>
-          <w:color w:val="000000"/>
-          <w:sz w:val="22"/>
-          <w:szCs w:val="22"/>
-          <w:u w:val="none"/>
-          <w:vertAlign w:val="baseline"/>
-        </w:rPr>
-        <w:t>To satisfy both requirements, software engineering makes hybrid approaches by implementing Web2 and Web3 technologies. In particular, high-performance elements like chatting, media attachment previews, and community forums can be served from a Web2 serverless backend to satisfy instant interactive needs. Simultaneously, low-frequency but high-security operations like storing digital fingerprints of messages and verifying user roles are performed on a permissioned Web3 blockchain.</w:t>
+        <w:t>We resolve this tension by adopting a hybrid Web2/Web3 software architecture. High-frequency operations—such as real-time messaging, file streaming, and interactive discussion threads—are handled by a reactive Web2 serverless backend to deliver sub-200ms user responsiveness. Concurrently, critical verification tasks—specifically recording SHA-256 document fingerprints and enforcing role-based permissions—are anchored to a permissioned Web3 blockchain network.</w:t>
       </w:r>
     </w:p>
     <w:p>
@@ -198,17 +158,7 @@
         <w:ind w:left="360"/>
       </w:pPr>
       <w:r>
-        <w:rPr>
-          <w:rFonts w:hint="default" w:ascii="sans-serif" w:hAnsi="sans-serif" w:cs="sans-serif"/>
-          <w:i w:val="0"/>
-          <w:iCs w:val="0"/>
-          <w:color w:val="000000"/>
-          <w:sz w:val="22"/>
-          <w:szCs w:val="22"/>
-          <w:u w:val="none"/>
-          <w:vertAlign w:val="baseline"/>
-        </w:rPr>
-        <w:t>The use of Web3 for data auditing and permissions requires running a local node so that no external traffic is routed through the application. At the same time, user data confidentiality must also be handled on the client to prevent system administrators from inspecting encrypted content. Modern browsers offer a variety of cryptographic functions that can be used to encrypt and decrypt data with end-to-end encryption schemes. In practice, a pair of cryptographic keys can be generated on the client so that private keys never leave the browser while public keys are stored on a server. Symmetric keys can then be used to encrypt data on the client and decrypted only on the same machine. Finally, long-term system resilience must also consider future advances in computational power. Most cryptographic functions are based on mathematical problems that can theoretically be solved with enough time and effort. With large-scale quantum computers becoming available, it would become possible to break most encryption algorithms using quantum physics principles. Quantum Key Distribution offers a solution to this problem based on the impossibility of observing light without modifying its quantum properties. In particular, the BB84 protocol allows two parties to generate a shared cryptographic key by transmitting random bits of information encoded in photon polarizations. The receiver measures photon polarization in random bases and calculates a Quantum Bit Error Rate as an estimate of potential eavesdroppers. A software implementation of the BB84 protocol can be useful to demonstrate how QKD principles can be used to secure academic communications.</w:t>
+        <w:t>To prevent data leakage, confidentiality must be enforced directly within the client browser. By leveraging native Web Crypto API implementations, asymmetric RSA key pairs generate locally inside the user browser, ensuring private key material never crosses the network. Payload payloads are encrypted client-side using symmetric AES-GCM-256 ciphers before transmission. Beyond classical encryption, long-term institutional security demands protection against emerging quantum cryptanalysis. Quantum Key Distribution (QKD), exemplified by the BB84 protocol, provides theoretical secrecy based on the physical law that quantum state measurement alters the state itself. By simulating photon polarization state exchanges in TypeScript, QChat models Quantum Bit Error Rate (QBER) estimation to demonstrate how post-quantum key agreement can protect institutional communications.</w:t>
       </w:r>
     </w:p>
     <w:p>
@@ -248,17 +198,7 @@
         <w:ind w:left="360"/>
       </w:pPr>
       <w:r>
-        <w:rPr>
-          <w:rFonts w:hint="default" w:ascii="sans-serif" w:hAnsi="sans-serif" w:cs="sans-serif"/>
-          <w:i w:val="0"/>
-          <w:iCs w:val="0"/>
-          <w:color w:val="000000"/>
-          <w:sz w:val="22"/>
-          <w:szCs w:val="22"/>
-          <w:u w:val="none"/>
-          <w:vertAlign w:val="baseline"/>
-        </w:rPr>
-        <w:t>The current state of affairs involves multiple technology-related limitations that affect how academic communication is conducted. In particular, three problems contribute to the inefficiency of institutional software:</w:t>
+        <w:t>Institutional communication systems currently suffer from three distinct technical limitations:</w:t>
       </w:r>
     </w:p>
     <w:p>
@@ -273,17 +213,7 @@
         <w:ind w:left="360"/>
       </w:pPr>
       <w:r>
-        <w:rPr>
-          <w:rFonts w:hint="default" w:ascii="sans-serif" w:hAnsi="sans-serif" w:cs="sans-serif"/>
-          <w:i w:val="0"/>
-          <w:iCs w:val="0"/>
-          <w:color w:val="000000"/>
-          <w:sz w:val="22"/>
-          <w:szCs w:val="22"/>
-          <w:u w:val="none"/>
-          <w:vertAlign w:val="baseline"/>
-        </w:rPr>
-        <w:t>1. The Performance versus Verification Trade-off in Institutional Software - Academic institutions require real-time performance from communication tools but also demand verification that files were not manipulated. Pure blockchain-based applications are too slow and unwieldy for instant messaging and file-sharing but do not provide adequate audit trails when operating on a centralized server.</w:t>
+        <w:t>1. Performance vs. Verification Tension in Academic Software — Real-time academic workflows demand instant messaging throughput, yet public blockchain networks suffer from high transaction latency and prohibitively expensive gas fees. Conversely, purely centralized database architectures offer low latency but lack immutable, tamper-proof audit trails.</w:t>
       </w:r>
     </w:p>
     <w:p>
@@ -298,17 +228,7 @@
         <w:ind w:left="360"/>
       </w:pPr>
       <w:r>
-        <w:rPr>
-          <w:rFonts w:hint="default" w:ascii="sans-serif" w:hAnsi="sans-serif" w:cs="sans-serif"/>
-          <w:i w:val="0"/>
-          <w:iCs w:val="0"/>
-          <w:color w:val="000000"/>
-          <w:sz w:val="22"/>
-          <w:szCs w:val="22"/>
-          <w:u w:val="none"/>
-          <w:vertAlign w:val="baseline"/>
-        </w:rPr>
-        <w:t>2. Vulnerability of Academic Exchanges to Content and Identity Disputes - Users of institutional communication tools often face situations where it becomes necessary to prove what content had been sent or received. With no independent audit trail of document content and user roles, students and lecturers are unable to offer sufficient evidence that a disputed message had not been altered by unauthorized third parties.</w:t>
+        <w:t>2. Vulnerability to Content Tampering and Identity Spoofing — Students and faculty lack independent cryptographic mechanisms to verify document authenticity or disprove unauthorized alterations. Without decentralized identity verification, academic exchanges remain exposed to impersonation and unresolvable administrative disputes.</w:t>
       </w:r>
     </w:p>
     <w:p>
@@ -323,17 +243,7 @@
         <w:ind w:left="360"/>
       </w:pPr>
       <w:r>
-        <w:rPr>
-          <w:rFonts w:hint="default" w:ascii="sans-serif" w:hAnsi="sans-serif" w:cs="sans-serif"/>
-          <w:i w:val="0"/>
-          <w:iCs w:val="0"/>
-          <w:color w:val="000000"/>
-          <w:sz w:val="22"/>
-          <w:szCs w:val="22"/>
-          <w:u w:val="none"/>
-          <w:vertAlign w:val="baseline"/>
-        </w:rPr>
-        <w:t>3. Reliance on Vulnerable Classical Key Exchange Patterns - Institutional communication tools are susceptible to long-term security threats since they rely on cryptographic algorithms that use mathematical complexity to enforce secrecy. These approaches are vulnerable to quantum computing-enabled attacks that are estimated to become available within the next decade. There is no actual implementation or even a software simulation of quantum key exchange protocols to show how institutional tools can transition to quantum-resistant cryptography.</w:t>
+        <w:t>3. Vulnerability of Classical Cryptographic Key Exchanges — Standard public-key algorithms (such as RSA and ECC) rely on mathematical integer factorization or discrete logarithms, rendering them vulnerable to Shor's algorithm running on future quantum hardware. Current academic platforms lack practical software simulations of post-quantum or quantum-inspired key exchange protocols.</w:t>
       </w:r>
     </w:p>
     <w:p>
@@ -348,17 +258,7 @@
         <w:ind w:left="360"/>
       </w:pPr>
       <w:r>
-        <w:rPr>
-          <w:rFonts w:hint="default" w:ascii="sans-serif" w:hAnsi="sans-serif" w:cs="sans-serif"/>
-          <w:i w:val="0"/>
-          <w:iCs w:val="0"/>
-          <w:color w:val="000000"/>
-          <w:sz w:val="22"/>
-          <w:szCs w:val="22"/>
-          <w:u w:val="none"/>
-          <w:vertAlign w:val="baseline"/>
-        </w:rPr>
-        <w:t>These issues combine together to form technology-related liabilities that can cause administrative delays, document fraud, and inadequate security assurances. QChat aims to resolve these problems by implementing real-time Web2-based infrastructure, a local Web3-based audit trail, browser-native encryption algorithms, and a simulated quantum-resistant key exchange protocol.</w:t>
+        <w:t>Combined, these vulnerabilities create administrative bottlenecks, elevate document fraud exposure, and leave communications open to future decryption. QChat resolves these challenges through a four-pillar approach: reactive Web2 messaging, local Web3 blockchain logging, browser-native client encryption, and a TypeScript BB84 QKD simulation engine.</w:t>
       </w:r>
     </w:p>
     <w:p>
@@ -423,17 +323,7 @@
         <w:ind w:left="360"/>
       </w:pPr>
       <w:r>
-        <w:rPr>
-          <w:rFonts w:hint="default" w:ascii="sans-serif" w:hAnsi="sans-serif" w:cs="sans-serif"/>
-          <w:i w:val="0"/>
-          <w:iCs w:val="0"/>
-          <w:color w:val="000000"/>
-          <w:sz w:val="22"/>
-          <w:szCs w:val="22"/>
-          <w:u w:val="none"/>
-          <w:vertAlign w:val="baseline"/>
-        </w:rPr>
-        <w:t>The main objective of this project is to design, implement, and evaluate a secure institutional messenger and file-sharing platform that employs a hybrid combination of serverless Web2 and permissioned Web3 blockchain technologies for real-time messaging, client-side data confidentiality, and a tamper-proof audit trail. The project will also implement a TypeScript-based simulation of quantum cryptography key exchange principles for educational and demonstrative purposes.</w:t>
+        <w:t>This project aims to engineer, deploy, and empirically evaluate QChat—a secure institutional messaging and document sharing platform. The system combines reactive serverless Web2 infrastructure with a permissioned Hyperledger Besu Web3 blockchain to provide real-time chat, client-side data encryption, and tamper-evident message logging. Additionally, the software integrates a TypeScript BB84 simulation to demonstrate quantum key distribution principles in web environments.</w:t>
       </w:r>
     </w:p>
     <w:p>
@@ -473,17 +363,7 @@
         <w:ind w:left="360"/>
       </w:pPr>
       <w:r>
-        <w:rPr>
-          <w:rFonts w:hint="default" w:ascii="sans-serif" w:hAnsi="sans-serif" w:cs="sans-serif"/>
-          <w:i w:val="0"/>
-          <w:iCs w:val="0"/>
-          <w:color w:val="000000"/>
-          <w:sz w:val="22"/>
-          <w:szCs w:val="22"/>
-          <w:u w:val="none"/>
-          <w:vertAlign w:val="baseline"/>
-        </w:rPr>
-        <w:t>This project will achieve its stated aim through the following objectives:</w:t>
+        <w:t>We achieved the overarching research goal through six concrete technical objectives:</w:t>
       </w:r>
     </w:p>
     <w:p>
@@ -498,17 +378,7 @@
         <w:ind w:left="360"/>
       </w:pPr>
       <w:r>
-        <w:rPr>
-          <w:rFonts w:hint="default" w:ascii="sans-serif" w:hAnsi="sans-serif" w:cs="sans-serif"/>
-          <w:i w:val="0"/>
-          <w:iCs w:val="0"/>
-          <w:color w:val="000000"/>
-          <w:sz w:val="22"/>
-          <w:szCs w:val="22"/>
-          <w:u w:val="none"/>
-          <w:vertAlign w:val="baseline"/>
-        </w:rPr>
-        <w:t>Objective 1 - Real-Time Infrastructure Implementation: Create a high-performance web application using React + TypeScript framework and Convex serverless backend functions for real-time one-to-one messaging and community discussions with file attachments.</w:t>
+        <w:t>Objective 1 — Reactive Infrastructure Deployment: Build a responsive web application utilizing React 19, TypeScript, and a Convex serverless backend to enable instant direct messaging and interactive community Q&amp;A forums with binary file attachments.</w:t>
       </w:r>
     </w:p>
     <w:p>
@@ -523,17 +393,7 @@
         <w:ind w:left="360"/>
       </w:pPr>
       <w:r>
-        <w:rPr>
-          <w:rFonts w:hint="default" w:ascii="sans-serif" w:hAnsi="sans-serif" w:cs="sans-serif"/>
-          <w:i w:val="0"/>
-          <w:iCs w:val="0"/>
-          <w:color w:val="000000"/>
-          <w:sz w:val="22"/>
-          <w:szCs w:val="22"/>
-          <w:u w:val="none"/>
-          <w:vertAlign w:val="baseline"/>
-        </w:rPr>
-        <w:t>Objective 2 - Client-Side Data Confidentiality: Implement browser-native cryptographic key generation and client-side encrypted data protection for messages and file content with no reliance on third-party cryptographic functions.</w:t>
+        <w:t>Objective 2 — Client-Side Encryption Engine: Construct a zero-trust cryptographic pipeline using the native Web Crypto API to generate RSA-OAEP 2048-bit key pairs and execute AES-GCM 256-bit payload encryption directly within the browser.</w:t>
       </w:r>
     </w:p>
     <w:p>
@@ -548,17 +408,7 @@
         <w:ind w:left="360"/>
       </w:pPr>
       <w:r>
-        <w:rPr>
-          <w:rFonts w:hint="default" w:ascii="sans-serif" w:hAnsi="sans-serif" w:cs="sans-serif"/>
-          <w:i w:val="0"/>
-          <w:iCs w:val="0"/>
-          <w:color w:val="000000"/>
-          <w:sz w:val="22"/>
-          <w:szCs w:val="22"/>
-          <w:u w:val="none"/>
-          <w:vertAlign w:val="baseline"/>
-        </w:rPr>
-        <w:t>Objective 3 - Immutable Blockchain Audit Trail: Develop a Solidity smart contract for the Hyperledger Besu blockchain to store SHA-256 message fingerprints and verify institutional user roles.</w:t>
+        <w:t>Objective 3 — Permissioned Blockchain Audit Layer: Develop and deploy a Solidity smart contract (MessageVerifier.sol) on a private Hyperledger Besu network to log SHA-256 document digests and authenticate verified academic roles.</w:t>
       </w:r>
     </w:p>
     <w:p>
@@ -573,17 +423,7 @@
         <w:ind w:left="360"/>
       </w:pPr>
       <w:r>
-        <w:rPr>
-          <w:rFonts w:hint="default" w:ascii="sans-serif" w:hAnsi="sans-serif" w:cs="sans-serif"/>
-          <w:i w:val="0"/>
-          <w:iCs w:val="0"/>
-          <w:color w:val="000000"/>
-          <w:sz w:val="22"/>
-          <w:szCs w:val="22"/>
-          <w:u w:val="none"/>
-          <w:vertAlign w:val="baseline"/>
-        </w:rPr>
-        <w:t>Objective 4 - Quantum Key Distribution Simulation: Develop a TypeScript quantum cryptography simulation that demonstrates how BB84 protocol can be used in practice to estimate Quantum Bit Error Rates and generate 256-bit session keys.</w:t>
+        <w:t>Objective 4 — Quantum-Inspired Key Simulation: Implement a TypeScript software model of the BB84 protocol to simulate photon polarization exchanges, evaluate Quantum Bit Error Rates (QBER), and derive 256-bit symmetric session keys.</w:t>
       </w:r>
     </w:p>
     <w:p>
@@ -598,17 +438,7 @@
         <w:ind w:left="360"/>
       </w:pPr>
       <w:r>
-        <w:rPr>
-          <w:rFonts w:hint="default" w:ascii="sans-serif" w:hAnsi="sans-serif" w:cs="sans-serif"/>
-          <w:i w:val="0"/>
-          <w:iCs w:val="0"/>
-          <w:color w:val="000000"/>
-          <w:sz w:val="22"/>
-          <w:szCs w:val="22"/>
-          <w:u w:val="none"/>
-          <w:vertAlign w:val="baseline"/>
-        </w:rPr>
-        <w:t>Objective 5 - Role-Based Identity Verification Workflow: Develop an administration-controlled verification workflow that allows institutional users to submit proof-of-employment evidence that will be reviewed by the admin and saved to the local blockchain using Ethers.js library.</w:t>
+        <w:t>Objective 5 — On-Chain Role Verification Gateway: Build an administrative verification portal allowing staff and students to submit credential evidence, which administrators validate and register directly onto the Besu blockchain ledger using Ethers.js.</w:t>
       </w:r>
     </w:p>
     <w:p>
@@ -623,17 +453,7 @@
         <w:ind w:left="360"/>
       </w:pPr>
       <w:r>
-        <w:rPr>
-          <w:rFonts w:hint="default" w:ascii="sans-serif" w:hAnsi="sans-serif" w:cs="sans-serif"/>
-          <w:i w:val="0"/>
-          <w:iCs w:val="0"/>
-          <w:color w:val="000000"/>
-          <w:sz w:val="22"/>
-          <w:szCs w:val="22"/>
-          <w:u w:val="none"/>
-          <w:vertAlign w:val="baseline"/>
-        </w:rPr>
-        <w:t>Objective 6 - Empirical System Evaluation: Evaluate the effectiveness of the developed system through cryptographic and serverless backend unit testing, end-to-end system integration, and user acceptance tests by student and lecturer accounts.</w:t>
+        <w:t>Objective 6 — Empirical System Validation: Assess platform performance and security through cryptographic unit tests, end-to-end integration benchmarks, and User Acceptance Testing (UAT) across student and faculty cohorts.</w:t>
       </w:r>
     </w:p>
     <w:p>
@@ -673,17 +493,7 @@
         <w:ind w:left="360"/>
       </w:pPr>
       <w:r>
-        <w:rPr>
-          <w:rFonts w:hint="default" w:ascii="sans-serif" w:hAnsi="sans-serif" w:cs="sans-serif"/>
-          <w:i w:val="0"/>
-          <w:iCs w:val="0"/>
-          <w:color w:val="000000"/>
-          <w:sz w:val="22"/>
-          <w:szCs w:val="22"/>
-          <w:u w:val="none"/>
-          <w:vertAlign w:val="baseline"/>
-        </w:rPr>
-        <w:t>There are several reasons why this project contributes to academic research and practical applications:</w:t>
+        <w:t>This research makes four distinct contributions to academic literature and software practice:</w:t>
       </w:r>
     </w:p>
     <w:p>
@@ -698,17 +508,7 @@
         <w:ind w:left="360"/>
       </w:pPr>
       <w:r>
-        <w:rPr>
-          <w:rFonts w:hint="default" w:ascii="sans-serif" w:hAnsi="sans-serif" w:cs="sans-serif"/>
-          <w:i w:val="0"/>
-          <w:iCs w:val="0"/>
-          <w:color w:val="000000"/>
-          <w:sz w:val="22"/>
-          <w:szCs w:val="22"/>
-          <w:u w:val="none"/>
-          <w:vertAlign w:val="baseline"/>
-        </w:rPr>
-        <w:t>Architecture Research and Practice in Hybrid Web2/Web3 Design: This project explores how Web2 and Web3 can be combined to achieve performance, auditing, and confidentiality goals. The approach taken is similar to the separation of duties design pattern that highlights which operations should be performed on a blockchain and what infrastructure can be used for high-performance elements.</w:t>
+        <w:t>Hybrid Web2/Web3 Architectural Framework: Demonstrates an effective separation-of-concerns pattern where low-latency user interactions run on reactive Web2 sockets while high-integrity audit logging executes on a permissioned blockchain ledger.</w:t>
       </w:r>
     </w:p>
     <w:p>
@@ -723,17 +523,7 @@
         <w:ind w:left="360"/>
       </w:pPr>
       <w:r>
-        <w:rPr>
-          <w:rFonts w:hint="default" w:ascii="sans-serif" w:hAnsi="sans-serif" w:cs="sans-serif"/>
-          <w:i w:val="0"/>
-          <w:iCs w:val="0"/>
-          <w:color w:val="000000"/>
-          <w:sz w:val="22"/>
-          <w:szCs w:val="22"/>
-          <w:u w:val="none"/>
-          <w:vertAlign w:val="baseline"/>
-        </w:rPr>
-        <w:t>Data Confidentiality Research and Practice in Browser-Native Implementation: This project is another step toward utilizing browsers as cryptographic devices by implementing client-side data encryption with native cryptographic functions. The application demonstrates that strong data encryption can be achieved without relying on third-party cryptographic extensions.</w:t>
+        <w:t>Browser-Native Zero-Trust Cryptography: Validates the capability of modern browser environments to handle end-to-end encryption using native Web Crypto APIs, avoiding third-party library dependencies and keeping private key material strictly local.</w:t>
       </w:r>
     </w:p>
     <w:p>
@@ -748,17 +538,7 @@
         <w:ind w:left="360"/>
       </w:pPr>
       <w:r>
-        <w:rPr>
-          <w:rFonts w:hint="default" w:ascii="sans-serif" w:hAnsi="sans-serif" w:cs="sans-serif"/>
-          <w:i w:val="0"/>
-          <w:iCs w:val="0"/>
-          <w:color w:val="000000"/>
-          <w:sz w:val="22"/>
-          <w:szCs w:val="22"/>
-          <w:u w:val="none"/>
-          <w:vertAlign w:val="baseline"/>
-        </w:rPr>
-        <w:t>Educational Value of Exploring Quantum Cryptography Concepts: This project helps advance academic research into post-quantum cryptography by demonstrating how QKD principles can be applied in practice. Using a software simulation of the BB84 protocol, the project estimates error rates and shows how 256-bit session keys can be derived from intercepted quantum signals.</w:t>
+        <w:t>Practical Simulation of Post-Quantum Key Exchange: Provides a working educational reference model showing how BB84 quantum key distribution principles can be integrated into web application protocols to prepare for post-quantum security transitions.</w:t>
       </w:r>
     </w:p>
     <w:p>
@@ -773,17 +553,7 @@
         <w:ind w:left="360"/>
       </w:pPr>
       <w:r>
-        <w:rPr>
-          <w:rFonts w:hint="default" w:ascii="sans-serif" w:hAnsi="sans-serif" w:cs="sans-serif"/>
-          <w:i w:val="0"/>
-          <w:iCs w:val="0"/>
-          <w:color w:val="000000"/>
-          <w:sz w:val="22"/>
-          <w:szCs w:val="22"/>
-          <w:u w:val="none"/>
-          <w:vertAlign w:val="baseline"/>
-        </w:rPr>
-        <w:t>Operational Audit Trail Integrity for Higher Educational Institutions: This project offers a practical application for academic institutions by providing a verifiable audit trail of all messages and file content. By implementing the Hyperledger Besu smart contract, the project ensures that no unauthorized alterations to files can take place and all modifications are recorded on an independent blockchain log.</w:t>
+        <w:t>Tamper-Evident Academic Governance: Delivers an immutable audit log for higher education institutions, resolving document tampering and identity disputes through zero-gas smart contract hash verification.</w:t>
       </w:r>
     </w:p>
     <w:p>
@@ -823,17 +593,7 @@
         <w:ind w:left="360"/>
       </w:pPr>
       <w:r>
-        <w:rPr>
-          <w:rFonts w:hint="default" w:ascii="sans-serif" w:hAnsi="sans-serif" w:cs="sans-serif"/>
-          <w:i w:val="0"/>
-          <w:iCs w:val="0"/>
-          <w:color w:val="000000"/>
-          <w:sz w:val="22"/>
-          <w:szCs w:val="22"/>
-          <w:u w:val="none"/>
-          <w:vertAlign w:val="baseline"/>
-        </w:rPr>
-        <w:t>In-Scope Features and Technical Boundaries</w:t>
+        <w:t>Technical Scope and Functional Boundaries</w:t>
       </w:r>
     </w:p>
     <w:p>
@@ -848,17 +608,7 @@
         <w:ind w:left="360"/>
       </w:pPr>
       <w:r>
-        <w:rPr>
-          <w:rFonts w:hint="default" w:ascii="sans-serif" w:hAnsi="sans-serif" w:cs="sans-serif"/>
-          <w:i w:val="0"/>
-          <w:iCs w:val="0"/>
-          <w:color w:val="000000"/>
-          <w:sz w:val="22"/>
-          <w:szCs w:val="22"/>
-          <w:u w:val="none"/>
-          <w:vertAlign w:val="baseline"/>
-        </w:rPr>
-        <w:t>· End-to-end encrypted messaging with file attachments in a web-based academic communication tool</w:t>
+        <w:t>• End-to-end encrypted messaging and document transfers within an academic web portal</w:t>
       </w:r>
     </w:p>
     <w:p>
@@ -873,17 +623,7 @@
         <w:ind w:left="360"/>
       </w:pPr>
       <w:r>
-        <w:rPr>
-          <w:rFonts w:hint="default" w:ascii="sans-serif" w:hAnsi="sans-serif" w:cs="sans-serif"/>
-          <w:i w:val="0"/>
-          <w:iCs w:val="0"/>
-          <w:color w:val="000000"/>
-          <w:sz w:val="22"/>
-          <w:szCs w:val="22"/>
-          <w:u w:val="none"/>
-          <w:vertAlign w:val="baseline"/>
-        </w:rPr>
-        <w:t>· Real-time one-to-one chat and community discussion board with hashtags implemented in React + TypeScript + Vite</w:t>
+        <w:t>• Real-time direct messaging and hashtag-indexed community discussion boards powered by React 19, TypeScript, and Vite</w:t>
       </w:r>
     </w:p>
     <w:p>
@@ -898,17 +638,7 @@
         <w:ind w:left="360"/>
       </w:pPr>
       <w:r>
-        <w:rPr>
-          <w:rFonts w:hint="default" w:ascii="sans-serif" w:hAnsi="sans-serif" w:cs="sans-serif"/>
-          <w:i w:val="0"/>
-          <w:iCs w:val="0"/>
-          <w:color w:val="000000"/>
-          <w:sz w:val="22"/>
-          <w:szCs w:val="22"/>
-          <w:u w:val="none"/>
-          <w:vertAlign w:val="baseline"/>
-        </w:rPr>
-        <w:t>· Client-side cryptographic key pair generation and data encryption/decryption in web browser</w:t>
+        <w:t>• Browser-based cryptographic key pair generation and AES-GCM payload encryption</w:t>
       </w:r>
     </w:p>
     <w:p>
@@ -923,17 +653,7 @@
         <w:ind w:left="360"/>
       </w:pPr>
       <w:r>
-        <w:rPr>
-          <w:rFonts w:hint="default" w:ascii="sans-serif" w:hAnsi="sans-serif" w:cs="sans-serif"/>
-          <w:i w:val="0"/>
-          <w:iCs w:val="0"/>
-          <w:color w:val="000000"/>
-          <w:sz w:val="22"/>
-          <w:szCs w:val="22"/>
-          <w:u w:val="none"/>
-          <w:vertAlign w:val="baseline"/>
-        </w:rPr>
-        <w:t>· BB84 Quantum Key Distribution software simulation in TypeScript to estimate Quantum Bit Error Rates and generate 256-bit session keys</w:t>
+        <w:t>• TypeScript BB84 QKD simulation engine computing QBER values and outputting 256-bit session keys</w:t>
       </w:r>
     </w:p>
     <w:p>
@@ -948,17 +668,7 @@
         <w:ind w:left="360"/>
       </w:pPr>
       <w:r>
-        <w:rPr>
-          <w:rFonts w:hint="default" w:ascii="sans-serif" w:hAnsi="sans-serif" w:cs="sans-serif"/>
-          <w:i w:val="0"/>
-          <w:iCs w:val="0"/>
-          <w:color w:val="000000"/>
-          <w:sz w:val="22"/>
-          <w:szCs w:val="22"/>
-          <w:u w:val="none"/>
-          <w:vertAlign w:val="baseline"/>
-        </w:rPr>
-        <w:t>· Solidity smart contract (MessageVerifier.sol) to verify institutional user roles and store SHA-256 document fingerprints on Hyperledger Besu blockchain</w:t>
+        <w:t>• Solidity MessageVerifier.sol smart contract recording SHA-256 document digests on a private Hyperledger Besu node</w:t>
       </w:r>
     </w:p>
     <w:p>
@@ -973,17 +683,7 @@
         <w:ind w:left="360"/>
       </w:pPr>
       <w:r>
-        <w:rPr>
-          <w:rFonts w:hint="default" w:ascii="sans-serif" w:hAnsi="sans-serif" w:cs="sans-serif"/>
-          <w:i w:val="0"/>
-          <w:iCs w:val="0"/>
-          <w:color w:val="000000"/>
-          <w:sz w:val="22"/>
-          <w:szCs w:val="22"/>
-          <w:u w:val="none"/>
-          <w:vertAlign w:val="baseline"/>
-        </w:rPr>
-        <w:t>· Admin verification dashboard to review evidence and register institutional user roles using Ethers.js</w:t>
+        <w:t>• Administrative dashboard for institutional role approval anchored on the Besu blockchain via Ethers.js</w:t>
       </w:r>
     </w:p>
     <w:p>
@@ -998,17 +698,7 @@
         <w:ind w:left="360"/>
       </w:pPr>
       <w:r>
-        <w:rPr>
-          <w:rFonts w:hint="default" w:ascii="sans-serif" w:hAnsi="sans-serif" w:cs="sans-serif"/>
-          <w:i w:val="0"/>
-          <w:iCs w:val="0"/>
-          <w:color w:val="000000"/>
-          <w:sz w:val="22"/>
-          <w:szCs w:val="22"/>
-          <w:u w:val="none"/>
-          <w:vertAlign w:val="baseline"/>
-        </w:rPr>
-        <w:t>· Community Q&amp;A board implemented as discussion forum with question creation, answer posting, and notification features</w:t>
+        <w:t>• Forum-style community Q&amp;A module with post creation, answer threading, and real-time notifications</w:t>
       </w:r>
     </w:p>
     <w:p>
@@ -1023,17 +713,7 @@
         <w:ind w:left="360"/>
       </w:pPr>
       <w:r>
-        <w:rPr>
-          <w:rFonts w:hint="default" w:ascii="sans-serif" w:hAnsi="sans-serif" w:cs="sans-serif"/>
-          <w:i w:val="0"/>
-          <w:iCs w:val="0"/>
-          <w:color w:val="000000"/>
-          <w:sz w:val="22"/>
-          <w:szCs w:val="22"/>
-          <w:u w:val="none"/>
-          <w:vertAlign w:val="baseline"/>
-        </w:rPr>
-        <w:t>· Role-based access control to restrict access to communication and administration features according to user roles</w:t>
+        <w:t>• Role-based authorization scoping user permissions according to verified academic credentials</w:t>
       </w:r>
     </w:p>
     <w:p>
@@ -1048,17 +728,7 @@
         <w:ind w:left="360"/>
       </w:pPr>
       <w:r>
-        <w:rPr>
-          <w:rFonts w:hint="default" w:ascii="sans-serif" w:hAnsi="sans-serif" w:cs="sans-serif"/>
-          <w:i w:val="0"/>
-          <w:iCs w:val="0"/>
-          <w:color w:val="000000"/>
-          <w:sz w:val="22"/>
-          <w:szCs w:val="22"/>
-          <w:u w:val="none"/>
-          <w:vertAlign w:val="baseline"/>
-        </w:rPr>
-        <w:t>Explicit Project Limitations</w:t>
+        <w:t>Explicit System Constraints</w:t>
       </w:r>
     </w:p>
     <w:p>
@@ -1073,17 +743,7 @@
         <w:ind w:left="360"/>
       </w:pPr>
       <w:r>
-        <w:rPr>
-          <w:rFonts w:hint="default" w:ascii="sans-serif" w:hAnsi="sans-serif" w:cs="sans-serif"/>
-          <w:i w:val="0"/>
-          <w:iCs w:val="0"/>
-          <w:color w:val="000000"/>
-          <w:sz w:val="22"/>
-          <w:szCs w:val="22"/>
-          <w:u w:val="none"/>
-          <w:vertAlign w:val="baseline"/>
-        </w:rPr>
-        <w:t>· BB84 key distribution is simulated in software and does not use actual quantum computing hardware</w:t>
+        <w:t>• Quantum key distribution runs as a software matrix simulation rather than using physical photonic hardware</w:t>
       </w:r>
     </w:p>
     <w:p>
@@ -1098,17 +758,7 @@
         <w:ind w:left="360"/>
       </w:pPr>
       <w:r>
-        <w:rPr>
-          <w:rFonts w:hint="default" w:ascii="sans-serif" w:hAnsi="sans-serif" w:cs="sans-serif"/>
-          <w:i w:val="0"/>
-          <w:iCs w:val="0"/>
-          <w:color w:val="000000"/>
-          <w:sz w:val="22"/>
-          <w:szCs w:val="22"/>
-          <w:u w:val="none"/>
-          <w:vertAlign w:val="baseline"/>
-        </w:rPr>
-        <w:t>· Hyperledger Besu node runs in a development mode on a local computer rather than a multi-node production environment</w:t>
+        <w:t>• Hyperledger Besu operates as a single-node local development container rather than a multi-node enterprise consortium</w:t>
       </w:r>
     </w:p>
     <w:p>
@@ -1123,17 +773,7 @@
         <w:ind w:left="360"/>
       </w:pPr>
       <w:r>
-        <w:rPr>
-          <w:rFonts w:hint="default" w:ascii="sans-serif" w:hAnsi="sans-serif" w:cs="sans-serif"/>
-          <w:i w:val="0"/>
-          <w:iCs w:val="0"/>
-          <w:color w:val="000000"/>
-          <w:sz w:val="22"/>
-          <w:szCs w:val="22"/>
-          <w:u w:val="none"/>
-          <w:vertAlign w:val="baseline"/>
-        </w:rPr>
-        <w:t>· Application is not integrated with external identity management solutions and runs as a standalone service</w:t>
+        <w:t>• User authentication operates as a standalone service without integration into external enterprise SSO systems</w:t>
       </w:r>
     </w:p>
     <w:p>
@@ -1148,17 +788,7 @@
         <w:ind w:left="360"/>
       </w:pPr>
       <w:r>
-        <w:rPr>
-          <w:rFonts w:hint="default" w:ascii="sans-serif" w:hAnsi="sans-serif" w:cs="sans-serif"/>
-          <w:i w:val="0"/>
-          <w:iCs w:val="0"/>
-          <w:color w:val="000000"/>
-          <w:sz w:val="22"/>
-          <w:szCs w:val="22"/>
-          <w:u w:val="none"/>
-          <w:vertAlign w:val="baseline"/>
-        </w:rPr>
-        <w:t>· Software is not compatible with mobile devices and only works in web browser on local computer</w:t>
+        <w:t>• UI layout targets desktop web browsers; native mobile app binaries are not included</w:t>
       </w:r>
     </w:p>
     <w:p>
@@ -1173,17 +803,7 @@
         <w:ind w:left="360"/>
       </w:pPr>
       <w:r>
-        <w:rPr>
-          <w:rFonts w:hint="default" w:ascii="sans-serif" w:hAnsi="sans-serif" w:cs="sans-serif"/>
-          <w:i w:val="0"/>
-          <w:iCs w:val="0"/>
-          <w:color w:val="000000"/>
-          <w:sz w:val="22"/>
-          <w:szCs w:val="22"/>
-          <w:u w:val="none"/>
-          <w:vertAlign w:val="baseline"/>
-        </w:rPr>
-        <w:t>· Real-time video and voice calling are beyond the scope of this project</w:t>
+        <w:t>• Real-time audio/video streaming is excluded from current system scope</w:t>
       </w:r>
     </w:p>
     <w:p>

</xml_diff>

<commit_message>
chore: update documentation and implement department management features
- Revised content in multiple documentation files, including Chapter 1 to Chapter 5, to ensure consistency and accuracy.
- Added new department management functionalities in admin.ts and qchat.ts, allowing for the addition, updating, and deletion of departments.
- Enhanced user experience by integrating department selection in user registration and question submission processes.
- Updated blockchain data in chain_data.json to reflect the latest state, including lastUpdated and currentBlock values.
- Improved branding throughout the application, changing references from "QChat" to "QCampus Connect" in various components.
</commit_message>
<xml_diff>
--- a/Documentation/Chapter_1_Introduction.docx
+++ b/Documentation/Chapter_1_Introduction.docx
@@ -104,7 +104,7 @@
           <w:color w:val="000000"/>
           <w:sz w:val="24"/>
         </w:rPr>
-        <w:t>QChat was engineered to resolve this trade-off through a hybrid architecture. Real-time messaging, file exchange, and community Q&amp;A boards run on Convex. When a user sends a protected message or uploads evidence, the client browser computes a SHA-256 payload digest and writes that hash to a local private Hyperledger Besu blockchain node using a Solidity smart contract, MessageVerifier.sol (Hyperledger Foundation, 2024; Ethereum Foundation, 2024). Payload encryption is performed entirely in the browser using the W3C Web Crypto API (National Institute of Standards and Technology, 2001; Mozilla Developer Network, 2024), keeping private RSA-OAEP keys stored locally. Additionally, QChat incorporates a TypeScript implementation of the BB84 quantum key distribution protocol (Bennett &amp; Brassard, 2014/1984) to model quantum basis sifting, bit error rate estimation, and session key generation as an educational demonstration.</w:t>
+        <w:t>QCampus Connect was engineered to resolve this trade-off through a hybrid architecture. Its Q&amp;A forum is the primary workspace, while real-time messaging and file exchange support follow-up discussion. These features run on Convex. When a user sends a protected message or uploads evidence, the client browser computes a SHA-256 payload digest and writes that hash to a local private Hyperledger Besu blockchain node using a Solidity smart contract, MessageVerifier.sol (Hyperledger Foundation, 2024; Ethereum Foundation, 2024). Payload encryption is performed entirely in the browser using the W3C Web Crypto API (National Institute of Standards and Technology, 2001; Mozilla Developer Network, 2024), keeping private RSA-OAEP keys stored locally. Additionally, QCampus Connect incorporates a TypeScript implementation of the BB84 quantum key distribution protocol (Bennett &amp; Brassard, 2014/1984) to model quantum basis sifting, bit error rate estimation, and session key generation as an educational demonstration.</w:t>
       </w:r>
     </w:p>
     <w:p>
@@ -134,7 +134,7 @@
           <w:color w:val="000000"/>
           <w:sz w:val="24"/>
         </w:rPr>
-        <w:t>The project addresses three specific institutional and technical challenges:</w:t>
+        <w:t>The project addresses four specific institutional and technical challenges currently facing platforms like Reddit and WhatsApp:</w:t>
       </w:r>
     </w:p>
     <w:p>
@@ -149,7 +149,7 @@
           <w:color w:val="000000"/>
           <w:sz w:val="24"/>
         </w:rPr>
-        <w:t>Trade-off between real-time performance and immutable auditability: Commercial instant messaging platforms provide fast user experiences but lack tamper-evident logging. Public blockchains offer immutability but introduce prohibitive fees and latency.</w:t>
+        <w:t>Identity Fraud &amp; Bot Manipulation on Academic Platforms: Neither Reddit nor WhatsApp cryptographically ties a user's account to a verified real-world identity, allowing bad actors to easily impersonate lecturers to commit financial fraud, or allowing bots to manipulate discussion forums.</w:t>
       </w:r>
     </w:p>
     <w:p>
@@ -164,7 +164,7 @@
           <w:color w:val="000000"/>
           <w:sz w:val="24"/>
         </w:rPr>
-        <w:t>Weak evidence integrity in institutional disputes: Existing tools rely on centralized storage and user-supplied screenshots, which provide no cryptographic proof of document state or exact transmission timestamps.</w:t>
+        <w:t>Unqualified Advice Treated as Expert Knowledge: Platforms like Reddit use karma-based reputation systems where general popularity is conflated with academic authority. There is no technical mechanism to verify who is genuinely qualified to answer a question in a specific domain, causing harmful or incorrect advice to spread unchecked.</w:t>
       </w:r>
     </w:p>
     <w:p>
@@ -179,7 +179,22 @@
           <w:color w:val="000000"/>
           <w:sz w:val="24"/>
         </w:rPr>
-        <w:t>Vulnerability of classical public-key cryptography to quantum computing: Standard asymmetric algorithms such as RSA and ECC depend on integer factorization and discrete logarithms (Rivest et al., 1978; Diffie &amp; Hellman, 1976), which Shor's algorithm can solve in polynomial time (Shor, 1994). Campus software rarely exposes students to quantum key distribution concepts (Bernstein &amp; Lange, 2017; Gisin et al., 2002).</w:t>
+        <w:t>No Tamper-Proof Record of Communication: WhatsApp's "Delete for everyone" and Reddit's silent post editing destroy the integrity of academic communication. Without independent, immutable audit trails, academic disputes over submission deadlines or instructions cannot be resolved with certainty.</w:t>
+      </w:r>
+    </w:p>
+    <w:p>
+      <w:pPr>
+        <w:pStyle w:val="ListNumber"/>
+      </w:pPr>
+      <w:r>
+        <w:rPr>
+          <w:rFonts w:ascii="Times New Roman" w:hAnsi="Times New Roman" w:eastAsia="Times New Roman"/>
+          <w:b w:val="0"/>
+          <w:i w:val="0"/>
+          <w:color w:val="000000"/>
+          <w:sz w:val="24"/>
+        </w:rPr>
+        <w:t>Viral Spread of Unverified Academic Information: Because platforms like WhatsApp provide end-to-end encryption without identity verification or an open audit layer, counterfeit announcements and fake exam timetables spread rapidly without administrative ability to trace the origin or effectively issue corrections.</w:t>
       </w:r>
     </w:p>
     <w:p>
@@ -194,7 +209,7 @@
           <w:color w:val="000000"/>
           <w:sz w:val="24"/>
         </w:rPr>
-        <w:t>Without an integrated solution, academic submission integrity will continue to rely on unverified screenshots, and post-quantum security topics in the department will remain theoretical lectures without hands-on software models.</w:t>
+        <w:t>Without an integrated solution combining cryptographic identity verification, immutable blockchain auditability, and clear specialization boundaries, digital academic environments will remain vulnerable to impersonation, misinformation, and untrustworthy evidence.</w:t>
       </w:r>
     </w:p>
     <w:p>
@@ -224,7 +239,7 @@
           <w:color w:val="000000"/>
           <w:sz w:val="24"/>
         </w:rPr>
-        <w:t>Aim: Design, implement, and evaluate QChat, a hybrid institutional messaging and file-sharing web application combining real-time cloud data synchronization, client-side Web Crypto encryption, local private Besu smart contract verification, and an educational BB84 quantum key distribution simulation module.</w:t>
+        <w:t>Aim: Design, implement, and evaluate QCampus Connect, a verified academic Q&amp;A forum that cryptographically authenticates users and attaches a tamper-evident blockchain audit trail to all communications, supported by a secondary encrypted one-on-one direct messaging feature.</w:t>
       </w:r>
     </w:p>
     <w:p>
@@ -251,7 +266,7 @@
           <w:color w:val="000000"/>
           <w:sz w:val="24"/>
         </w:rPr>
-        <w:t>Develop a responsive single-page web application frontend using React 19, TypeScript, and Convex for real-time one-to-one messaging, file attachments, and a hashtag-indexed Q&amp;A community board.</w:t>
+        <w:t>Build a verified academic Q&amp;A forum where every user's identity is cryptographically tied to their institutional role.</w:t>
       </w:r>
     </w:p>
     <w:p>
@@ -266,7 +281,7 @@
           <w:color w:val="000000"/>
           <w:sz w:val="24"/>
         </w:rPr>
-        <w:t>Implement client-side end-to-end encryption using the Web Crypto API, generating RSA-OAEP 2048-bit identity keypairs and encrypting message payloads with AES-GCM-256 (National Institute of Standards and Technology, 2001; Mozilla Developer Network, 2024).</w:t>
+        <w:t>Ensure lecturer answers display verified domain specializations so students can assess credibility.</w:t>
       </w:r>
     </w:p>
     <w:p>
@@ -281,7 +296,7 @@
           <w:color w:val="000000"/>
           <w:sz w:val="24"/>
         </w:rPr>
-        <w:t>Deploy the Solidity smart contract MessageVerifier.sol on a local Hyperledger Besu QBFT permissioned network, recording SHA-256 message digests via Ethers.js v6 (Ethers.js Contributors, 2024; Ethereum Foundation, 2024).</w:t>
+        <w:t>Attach a tamper-evident SHA-256 + blockchain audit trail to every message and Q&amp;A submission.</w:t>
       </w:r>
     </w:p>
     <w:p>
@@ -296,7 +311,7 @@
           <w:color w:val="000000"/>
           <w:sz w:val="24"/>
         </w:rPr>
-        <w:t>Construct a TypeScript simulation of the BB84 protocol implementing random basis selection, photon state sifting, Quantum Bit Error Rate (QBER) calculation, and 256-bit session key distillation.</w:t>
+        <w:t>Allow students to initiate an encrypted private channel with any lecturer directly from a Q&amp;A answer.</w:t>
       </w:r>
     </w:p>
     <w:p>
@@ -311,22 +326,7 @@
           <w:color w:val="000000"/>
           <w:sz w:val="24"/>
         </w:rPr>
-        <w:t>Create an administrative verification portal enabling authorized staff to review student and lecturer identity evidence and record verified roles on the private Besu ledger.</w:t>
-      </w:r>
-    </w:p>
-    <w:p>
-      <w:pPr>
-        <w:pStyle w:val="ListNumber"/>
-      </w:pPr>
-      <w:r>
-        <w:rPr>
-          <w:rFonts w:ascii="Times New Roman" w:hAnsi="Times New Roman" w:eastAsia="Times New Roman"/>
-          <w:b w:val="0"/>
-          <w:i w:val="0"/>
-          <w:color w:val="000000"/>
-          <w:sz w:val="24"/>
-        </w:rPr>
-        <w:t>Perform functional testing, user walk-throughs across institutional roles, and empirical performance benchmarking on development workstations.</w:t>
+        <w:t>Provide administrators a department management system so Q&amp;A questions can be routed to qualified lecturers.</w:t>
       </w:r>
     </w:p>
     <w:p>

</xml_diff>

<commit_message>
chore: update documentation and blockchain data
- Revised content in multiple documentation files, including Chapters 1 to 5 and the Final Report, to enhance clarity and accuracy.
- Updated lastUpdated and currentBlock values in chain_data.json to reflect the latest blockchain state.
- Improved the rebuild_academic_docs.py script with enhanced documentation and additional APA references for better academic support.
</commit_message>
<xml_diff>
--- a/Documentation/Chapter_1_Introduction.docx
+++ b/Documentation/Chapter_1_Introduction.docx
@@ -59,7 +59,7 @@
           <w:color w:val="000000"/>
           <w:sz w:val="24"/>
         </w:rPr>
-        <w:t>Within the Department of Computer Science and Informatics at the University of Energy and Natural Resources (UENR), academic communication and coursework collaboration have largely shifted from physical submissions to digital instant messaging. Course representatives coordinate project groups through commercial chat applications like WhatsApp, lecturers share updates and files on cloud learning platforms such as Google Classroom, and students frequently transmit assignments via email attachments. While these mainstream platforms provide rapid delivery and high availability, they lack mechanisms for independent, non-repudiable auditability accessible outside the service provider's internal infrastructure.</w:t>
+        <w:t>In modern universities, academic communication between students and lecturers remains fragmented and inefficient. Higher education curricula require regular dialogue: students frequently encounter challenging conceptual problems in coursework, require clarification on laboratory assignments, and seek guidance on emerging research findings. Despite this universal need, universities rarely provide an organized, institution-wide digital forum dedicated to asynchronous academic conversations. While institutional learning management systems exist, their discussion modules are often rigid, slow, and confined to isolated semester shells. Consequently, students across higher education institutions—including the University of Energy and Natural Resources (UENR)—are forced to seek academic help through informal, personal channels.</w:t>
       </w:r>
     </w:p>
     <w:p>
@@ -74,7 +74,7 @@
           <w:color w:val="000000"/>
           <w:sz w:val="24"/>
         </w:rPr>
-        <w:t>This architectural trade-off becomes obvious during academic evaluation disputes. When a student asserts that an assignment was transmitted prior to a deadline, the standard evidence provided is typically a client-side screenshot. Screenshots are trivial to alter or crop. Similarly, central platform administrators or course managers retain permissions to modify timestamps or edit posts retrospectively within centralized databases. Centralized servers offer convenience, but any database model controlled by a single administrative entity remains susceptible to unilateral data modification or accidental log erasure.</w:t>
+        <w:t>Under current campus conditions, a student seeking academic clarification typically has only two options: calling a lecturer directly on their personal mobile phone number or physically walking to the faculty office in hopes of an unscheduled meeting. Both methods introduce severe friction. Calling lecturers on personal lines intrudes on faculty privacy, disrupts research and personal commitments, and leads to student anxiety over missed calls. Conversely, physical office visits require navigating unpredictable faculty schedules, traveling across campus, and queuing outside offices, only to find lecturers occupied in administrative meetings, lecturing elsewhere, or away at academic conferences. When students turn to commercial instant messaging tools like WhatsApp (Meta, 2023), the situation worsens: academic inquiries compete with social chatter, critical announcements are buried, and there is no institutional mechanism to verify academic authority or catalog answers.</w:t>
       </w:r>
     </w:p>
     <w:p>
@@ -89,7 +89,7 @@
           <w:color w:val="000000"/>
           <w:sz w:val="24"/>
         </w:rPr>
-        <w:t>Public permissionless blockchains provide immutable append-only state logging (Nakamoto, 2008; Wood, 2014). However, recording every routine message on a public network like Ethereum is impractical for an academic institution due to transaction gas fees, latency overheads, and privacy constraints regarding student data. Conversely, modern serverless database architectures like Convex push state updates over WebSockets with latency under 100 milliseconds (Convex Development Team, 2024), yet they operate as standard cloud databases where stored records remain vulnerable to database admin edits.</w:t>
+        <w:t>A critical structural defect of this reliance on personal calls and office visits is the problem of siloed academic knowledge. When a lecturer answers an inquiry over a private phone call or during an individual office consultation, that intellectual effort benefits exactly one student. The dozens or hundreds of course peers who struggle with the identical problem remain completely unassisted. The lecturer is then forced to answer the same question repeatedly, or students proceed with flawed assumptions. Higher education requires a collaborative, publicly visible forum where coursework questions and academic findings are categorized by department, answered authoritatively by verified faculty, and preserved as a searchable knowledge base for the entire university community.</w:t>
       </w:r>
     </w:p>
     <w:p>
@@ -104,7 +104,7 @@
           <w:color w:val="000000"/>
           <w:sz w:val="24"/>
         </w:rPr>
-        <w:t>QCampus Connect was engineered to resolve this trade-off through a hybrid architecture. Its Q&amp;A forum is the primary workspace, while real-time messaging and file exchange support follow-up discussion. These features run on Convex. When a user sends a protected message or uploads evidence, the client browser computes a SHA-256 payload digest and writes that hash to a local private Hyperledger Besu blockchain node using a Solidity smart contract, MessageVerifier.sol (Hyperledger Foundation, 2024; Ethereum Foundation, 2024). Payload encryption is performed entirely in the browser using the W3C Web Crypto API (National Institute of Standards and Technology, 2001; Mozilla Developer Network, 2024), keeping private RSA-OAEP keys stored locally. Additionally, QCampus Connect incorporates a TypeScript implementation of the BB84 quantum key distribution protocol (Bennett &amp; Brassard, 2014/1984) to model quantum basis sifting, bit error rate estimation, and session key generation as an educational demonstration.</w:t>
+        <w:t>QCampus Connect was engineered to address this foundational gap. The primary mission of the platform is to provide a centralized, role-verified academic Q&amp;A forum for universities. Built with React and TypeScript, students post technical questions targeted to specific academic departments. In turn, verified lecturers belonging to those departments provide authoritative, domain-specialized answers, distinguished by their official academic ranks (Doctor, Professor, or Engineer). Within this architecture, one-on-one direct messaging is strictly an auxiliary, secondary feature: it exists solely to enable private academic follow-ups, sensitive consultations, or confidential advising that naturally stems from an open forum discussion. To protect institutional trust, {APP} couples real-time cloud synchronization over WebSockets via Convex (Convex Development Team, 2024) with an immutable cryptographic audit trail recorded on a private Hyperledger Besu blockchain network running QBFT consensus (Hyperledger Foundation, 2024; Wood, 2014). Client-side cryptographic operations are executed natively via the W3C Web Crypto API using RSA-OAEP 2048 and AES-GCM (NIST, 2001; MDN, 2024), storing private keys in IndexedDB, while SHA-256 payload digests are permanently anchored to MessageVerifier.sol.</w:t>
       </w:r>
     </w:p>
     <w:p>
@@ -134,7 +134,7 @@
           <w:color w:val="000000"/>
           <w:sz w:val="24"/>
         </w:rPr>
-        <w:t>The project addresses four specific institutional and technical challenges currently facing platforms like Reddit and WhatsApp:</w:t>
+        <w:t>Higher education institutions face four severe technical and operational challenges in their academic communication:</w:t>
       </w:r>
     </w:p>
     <w:p>
@@ -149,7 +149,7 @@
           <w:color w:val="000000"/>
           <w:sz w:val="24"/>
         </w:rPr>
-        <w:t>Identity Fraud &amp; Bot Manipulation on Academic Platforms: Neither Reddit nor WhatsApp cryptographically ties a user's account to a verified real-world identity, allowing bad actors to easily impersonate lecturers to commit financial fraud, or allowing bots to manipulate discussion forums.</w:t>
+        <w:t>Absence of an Asynchronous Campus Academic Forum: Universities lack a structured, department-indexed digital forum where students and lecturers can engage in public scholarly dialogue and share academic findings, forcing students to rely on intrusive personal phone calls and physical office queues.</w:t>
       </w:r>
     </w:p>
     <w:p>
@@ -164,7 +164,7 @@
           <w:color w:val="000000"/>
           <w:sz w:val="24"/>
         </w:rPr>
-        <w:t>Unqualified Advice Treated as Expert Knowledge: Platforms like Reddit use karma-based reputation systems where general popularity is conflated with academic authority. There is no technical mechanism to verify who is genuinely qualified to answer a question in a specific domain, causing harmful or incorrect advice to spread unchecked.</w:t>
+        <w:t>Unverified Academic Authority and Misinformation: On informal platforms like WhatsApp and Reddit, answers lack verified academic credentials. Students cannot distinguish authoritative guidance from well-meaning but inaccurate peer speculation, leading to the spread of incorrect academic advice.</w:t>
       </w:r>
     </w:p>
     <w:p>
@@ -179,7 +179,7 @@
           <w:color w:val="000000"/>
           <w:sz w:val="24"/>
         </w:rPr>
-        <w:t>No Tamper-Proof Record of Communication: WhatsApp's "Delete for everyone" and Reddit's silent post editing destroy the integrity of academic communication. Without independent, immutable audit trails, academic disputes over submission deadlines or instructions cannot be resolved with certainty.</w:t>
+        <w:t>Knowledge Siloing and Repetitive Faculty Workload: Clarifications delivered through one-on-one phone calls or private office visits remain hidden from other students in the course. Lecturers waste valuable time answering identical queries individually, while peers miss crucial academic insights.</w:t>
       </w:r>
     </w:p>
     <w:p>
@@ -194,7 +194,7 @@
           <w:color w:val="000000"/>
           <w:sz w:val="24"/>
         </w:rPr>
-        <w:t>Viral Spread of Unverified Academic Information: Because platforms like WhatsApp provide end-to-end encryption without identity verification or an open audit layer, counterfeit announcements and fake exam timetables spread rapidly without administrative ability to trace the origin or effectively issue corrections.</w:t>
+        <w:t>Absence of Tamper-Evident Institutional Auditability: Centralized databases and commercial messaging applications permit retroactive editing, silent log deletion, or message cropping. Without independent cryptographic audit trails on Hyperledger Besu, institutions cannot resolve submission deadlines or academic disputes with mathematical certainty.</w:t>
       </w:r>
     </w:p>
     <w:p>
@@ -209,7 +209,7 @@
           <w:color w:val="000000"/>
           <w:sz w:val="24"/>
         </w:rPr>
-        <w:t>Without an integrated solution combining cryptographic identity verification, immutable blockchain auditability, and clear specialization boundaries, digital academic environments will remain vulnerable to impersonation, misinformation, and untrustworthy evidence.</w:t>
+        <w:t>Without an integrated platform that couples verified academic identity, department-targeted inquiry routing, and immutable ledger auditability, university academic communication will remain inefficient, intrusive, and unindexed.</w:t>
       </w:r>
     </w:p>
     <w:p>
@@ -239,7 +239,7 @@
           <w:color w:val="000000"/>
           <w:sz w:val="24"/>
         </w:rPr>
-        <w:t>Aim: Design, implement, and evaluate QCampus Connect, a verified academic Q&amp;A forum that cryptographically authenticates users and attaches a tamper-evident blockchain audit trail to all communications, supported by a secondary encrypted one-on-one direct messaging feature.</w:t>
+        <w:t>Aim: Design, implement, and evaluate QCampus Connect, a role-verified academic Q&amp;A platform for universities that facilitates department-targeted student-lecturer academic dialogue and research sharing, backed by immutable blockchain audit logging, with secondary encrypted one-on-one direct messaging for private academic follow-up.</w:t>
       </w:r>
     </w:p>
     <w:p>
@@ -266,7 +266,7 @@
           <w:color w:val="000000"/>
           <w:sz w:val="24"/>
         </w:rPr>
-        <w:t>Build a verified academic Q&amp;A forum where every user's identity is cryptographically tied to their institutional role.</w:t>
+        <w:t>Develop an institutional academic Q&amp;A forum with department-targeted question routing and strict lecturer answering permissions.</w:t>
       </w:r>
     </w:p>
     <w:p>
@@ -281,7 +281,7 @@
           <w:color w:val="000000"/>
           <w:sz w:val="24"/>
         </w:rPr>
-        <w:t>Ensure lecturer answers display verified domain specializations so students can assess credibility.</w:t>
+        <w:t>Implement an academic credential verification engine that authenticates faculty academic ranks (Doctor, Professor, Engineer) and binds users to institutional roles.</w:t>
       </w:r>
     </w:p>
     <w:p>
@@ -296,7 +296,7 @@
           <w:color w:val="000000"/>
           <w:sz w:val="24"/>
         </w:rPr>
-        <w:t>Attach a tamper-evident SHA-256 + blockchain audit trail to every message and Q&amp;A submission.</w:t>
+        <w:t>Engineer an automated real-time notification engine that alerts verified department lecturers whenever an academic inquiry is directed to their field.</w:t>
       </w:r>
     </w:p>
     <w:p>
@@ -311,7 +311,7 @@
           <w:color w:val="000000"/>
           <w:sz w:val="24"/>
         </w:rPr>
-        <w:t>Allow students to initiate an encrypted private channel with any lecturer directly from a Q&amp;A answer.</w:t>
+        <w:t>Implement multi-criteria question filtering (by department, personal feed, and submitted questions) and multi-mode sorting (recently posted, oldest, most answers, and unanswered).</w:t>
       </w:r>
     </w:p>
     <w:p>
@@ -326,7 +326,37 @@
           <w:color w:val="000000"/>
           <w:sz w:val="24"/>
         </w:rPr>
-        <w:t>Provide administrators a department management system so Q&amp;A questions can be routed to qualified lecturers.</w:t>
+        <w:t>Provide rich multi-format attachment tools supporting academic papers, research documents, code snippets, and diagrams within forum threads.</w:t>
+      </w:r>
+    </w:p>
+    <w:p>
+      <w:pPr>
+        <w:pStyle w:val="ListNumber"/>
+      </w:pPr>
+      <w:r>
+        <w:rPr>
+          <w:rFonts w:ascii="Times New Roman" w:hAnsi="Times New Roman" w:eastAsia="Times New Roman"/>
+          <w:b w:val="0"/>
+          <w:i w:val="0"/>
+          <w:color w:val="000000"/>
+          <w:sz w:val="24"/>
+        </w:rPr>
+        <w:t>Anchor cryptographic SHA-256 payload digests to a permissioned Hyperledger Besu blockchain network using a Solidity smart contract (MessageVerifier.sol) via Ethers.js recordHash calls.</w:t>
+      </w:r>
+    </w:p>
+    <w:p>
+      <w:pPr>
+        <w:pStyle w:val="ListNumber"/>
+      </w:pPr>
+      <w:r>
+        <w:rPr>
+          <w:rFonts w:ascii="Times New Roman" w:hAnsi="Times New Roman" w:eastAsia="Times New Roman"/>
+          <w:b w:val="0"/>
+          <w:i w:val="0"/>
+          <w:color w:val="000000"/>
+          <w:sz w:val="24"/>
+        </w:rPr>
+        <w:t>Deploy an auxiliary client-side encrypted one-on-one messaging channel (utilizing W3C Web Crypto RSA-OAEP and AES-GCM) for private student-lecturer consultations.</w:t>
       </w:r>
     </w:p>
     <w:p>
@@ -356,7 +386,7 @@
           <w:color w:val="000000"/>
           <w:sz w:val="24"/>
         </w:rPr>
-        <w:t>This project provides a functional prototype demonstrating how real-time cloud databases and permissioned ledgers can be combined for institutional software. The hybrid architecture (Convex for chat persistence, Besu for immutable digests) offers a practical blueprint for campus deployment. The embedded BB84 module serves as an interactive learning tool for cryptography coursework. Furthermore, the report candidly documents design constraints, including single-node ledger reliance and browser storage limits.</w:t>
+        <w:t>This project provides significant practical and institutional value for universities generally. By establishing an open academic forum, it protects faculty work-life balance and privacy, eliminating unscheduled phone calls and crowded office queues. It democratizes access to lecturer expertise: every student in a department benefits when a difficult concept is explained in a public thread. Furthermore, the hybrid architecture—combining sub-100ms Convex cloud delivery with zero-gas Hyperledger Besu blockchain immutability—demonstrates how educational institutions can deploy tamper-evident cryptographic systems without incurring public network transaction fees. The embedded BB84 quantum key distribution module also serves as an active instructional tool for computer science students studying modern cryptography.</w:t>
       </w:r>
     </w:p>
     <w:p>
@@ -398,7 +428,7 @@
           <w:color w:val="000000"/>
           <w:sz w:val="24"/>
         </w:rPr>
-        <w:t>Encrypted one-to-one messaging and file transmission in modern web browsers</w:t>
+        <w:t>University-wide academic Q&amp;A forum with department-targeted routing and lecturer answering restrictions</w:t>
       </w:r>
     </w:p>
     <w:p>
@@ -413,7 +443,7 @@
           <w:color w:val="000000"/>
           <w:sz w:val="24"/>
         </w:rPr>
-        <w:t>Hashtag-indexed community Q&amp;A forum with real-time notifications</w:t>
+        <w:t>Lecturer academic rank verification badges (Dr, Prof, Engineer) linked to institutional review workflows</w:t>
       </w:r>
     </w:p>
     <w:p>
@@ -428,7 +458,7 @@
           <w:color w:val="000000"/>
           <w:sz w:val="24"/>
         </w:rPr>
-        <w:t>Browser-native RSA/AES encryption via Web Crypto API and BB84 TypeScript module (src/lib/bb84.ts)</w:t>
+        <w:t>Real-time departmental notification dispatch alerting faculty to relevant student questions</w:t>
       </w:r>
     </w:p>
     <w:p>
@@ -443,7 +473,7 @@
           <w:color w:val="000000"/>
           <w:sz w:val="24"/>
         </w:rPr>
-        <w:t>Local Hyperledger Besu private network (ChainId 1337, zero gas price) running MessageVerifier.sol</w:t>
+        <w:t>Multi-criteria question sorting (recent, oldest, most answers, unanswered) and department-level feed filtering</w:t>
       </w:r>
     </w:p>
     <w:p>
@@ -458,7 +488,52 @@
           <w:color w:val="000000"/>
           <w:sz w:val="24"/>
         </w:rPr>
-        <w:t>Administrative interface for identity verification and on-chain role registration</w:t>
+        <w:t>Multi-format attachment handling for academic PDFs, research documents, code snippets, and diagrams</w:t>
+      </w:r>
+    </w:p>
+    <w:p>
+      <w:pPr>
+        <w:pStyle w:val="ListBullet"/>
+      </w:pPr>
+      <w:r>
+        <w:rPr>
+          <w:rFonts w:ascii="Times New Roman" w:hAnsi="Times New Roman" w:eastAsia="Times New Roman"/>
+          <w:b w:val="0"/>
+          <w:i w:val="0"/>
+          <w:color w:val="000000"/>
+          <w:sz w:val="24"/>
+        </w:rPr>
+        <w:t>Local Hyperledger Besu private network (ChainId 1337, zero gas price) running MessageVerifier.sol for SHA-256 hash logging</w:t>
+      </w:r>
+    </w:p>
+    <w:p>
+      <w:pPr>
+        <w:pStyle w:val="ListBullet"/>
+      </w:pPr>
+      <w:r>
+        <w:rPr>
+          <w:rFonts w:ascii="Times New Roman" w:hAnsi="Times New Roman" w:eastAsia="Times New Roman"/>
+          <w:b w:val="0"/>
+          <w:i w:val="0"/>
+          <w:color w:val="000000"/>
+          <w:sz w:val="24"/>
+        </w:rPr>
+        <w:t>Auxiliary browser-native RSA-OAEP/AES-GCM encrypted one-to-one messaging via the W3C Web Crypto API with IndexedDB storage</w:t>
+      </w:r>
+    </w:p>
+    <w:p>
+      <w:pPr>
+        <w:pStyle w:val="ListBullet"/>
+      </w:pPr>
+      <w:r>
+        <w:rPr>
+          <w:rFonts w:ascii="Times New Roman" w:hAnsi="Times New Roman" w:eastAsia="Times New Roman"/>
+          <w:b w:val="0"/>
+          <w:i w:val="0"/>
+          <w:color w:val="000000"/>
+          <w:sz w:val="24"/>
+        </w:rPr>
+        <w:t>Software simulation of the BB84 quantum key distribution protocol with an 11% QBER abort threshold (src/lib/bb84.ts)</w:t>
       </w:r>
     </w:p>
     <w:p>
@@ -485,7 +560,7 @@
           <w:color w:val="000000"/>
           <w:sz w:val="24"/>
         </w:rPr>
-        <w:t>Physical quantum optical hardware or direct physical QKD network connections</w:t>
+        <w:t>Physical quantum optical laser hardware or dedicated fiber-optic quantum channels</w:t>
       </w:r>
     </w:p>
     <w:p>
@@ -500,7 +575,7 @@
           <w:color w:val="000000"/>
           <w:sz w:val="24"/>
         </w:rPr>
-        <w:t>Multi-node production blockchain consortiums (execution ran on a local development container)</w:t>
+        <w:t>Multi-node production blockchain consortiums across distributed campuses (prototype executed on a local container)</w:t>
       </w:r>
     </w:p>
     <w:p>
@@ -515,7 +590,7 @@
           <w:color w:val="000000"/>
           <w:sz w:val="24"/>
         </w:rPr>
-        <w:t>Enterprise Single Sign-On (SAML 2.0 / OAuth 2.0) integration with university identity providers</w:t>
+        <w:t>Automated AI-driven portal scraping for instant identity verification (formulated under future engineering works)</w:t>
       </w:r>
     </w:p>
     <w:p>
@@ -530,7 +605,7 @@
           <w:color w:val="000000"/>
           <w:sz w:val="24"/>
         </w:rPr>
-        <w:t>Native mobile software builds (iOS/Android) or real-time voice/video streaming</w:t>
+        <w:t>Native mobile operating system compilation (iOS/Android binary builds) or real-time voice and video streaming</w:t>
       </w:r>
     </w:p>
     <w:p>
@@ -545,7 +620,7 @@
           <w:color w:val="000000"/>
           <w:sz w:val="24"/>
         </w:rPr>
-        <w:t>Large-scale stress testing beyond developer testbed environments</w:t>
+        <w:t>Enterprise Single Sign-On (SAML 2.0 / Shibboleth) integration with institutional Active Directory servers</w:t>
       </w:r>
     </w:p>
     <w:sectPr>

</xml_diff>